<commit_message>
Added new assignments and discussion
</commit_message>
<xml_diff>
--- a/WK6_Discussion.docx
+++ b/WK6_Discussion.docx
@@ -1316,6 +1316,251 @@
     </w:p>
     <w:p>
       <w:pPr>
+        <w:pStyle w:val="NormalWeb"/>
+        <w:spacing w:before="180" w:beforeAutospacing="0" w:after="180" w:afterAutospacing="0" w:line="480" w:lineRule="auto"/>
+        <w:jc w:val="both"/>
+        <w:rPr>
+          <w:color w:val="444444"/>
+        </w:rPr>
+      </w:pPr>
+      <w:r>
+        <w:rPr>
+          <w:color w:val="444444"/>
+        </w:rPr>
+        <w:t>Response:2</w:t>
+      </w:r>
+    </w:p>
+    <w:p>
+      <w:pPr>
+        <w:pStyle w:val="NormalWeb"/>
+        <w:spacing w:before="180" w:beforeAutospacing="0" w:after="180" w:afterAutospacing="0" w:line="480" w:lineRule="auto"/>
+        <w:jc w:val="both"/>
+        <w:rPr>
+          <w:rFonts w:ascii="Lato" w:hAnsi="Lato"/>
+          <w:color w:val="444444"/>
+        </w:rPr>
+      </w:pPr>
+      <w:r>
+        <w:rPr>
+          <w:rFonts w:ascii="Lato" w:hAnsi="Lato"/>
+          <w:color w:val="444444"/>
+        </w:rPr>
+        <w:t>Hello Matthew,</w:t>
+      </w:r>
+    </w:p>
+    <w:p>
+      <w:pPr>
+        <w:pStyle w:val="NormalWeb"/>
+        <w:spacing w:before="180" w:beforeAutospacing="0" w:after="180" w:afterAutospacing="0" w:line="480" w:lineRule="auto"/>
+        <w:jc w:val="both"/>
+        <w:rPr>
+          <w:rFonts w:ascii="Lato" w:hAnsi="Lato"/>
+          <w:color w:val="444444"/>
+        </w:rPr>
+      </w:pPr>
+      <w:r>
+        <w:rPr>
+          <w:rFonts w:ascii="Lato" w:hAnsi="Lato"/>
+          <w:color w:val="444444"/>
+        </w:rPr>
+        <w:t>You clearly explain the core components of the Triangle Model, another health information technology evaluation framework that focuses on how technology influences the quality, safety, and efficiency of healthcare delivery. It considers the interactions among four core components: technology, providers, organizations, and patients. Additionally, it examines the interrelationships between technology and providers, technology and organizations, and organizations and providers to determine their collective impact on outcomes (</w:t>
+      </w:r>
+      <w:proofErr w:type="spellStart"/>
+      <w:r>
+        <w:rPr>
+          <w:rFonts w:ascii="Lato" w:hAnsi="Lato"/>
+          <w:color w:val="444444"/>
+        </w:rPr>
+        <w:t>Ancker</w:t>
+      </w:r>
+      <w:proofErr w:type="spellEnd"/>
+      <w:r>
+        <w:rPr>
+          <w:rFonts w:ascii="Lato" w:hAnsi="Lato"/>
+          <w:color w:val="444444"/>
+        </w:rPr>
+        <w:t xml:space="preserve"> et al., 2012). A significant strength of this model is its comprehensive nature it allows for an in-depth, multidimensional evaluation of a technology's impact. However, this complexity can also be a drawback, especially in cases </w:t>
+      </w:r>
+      <w:r>
+        <w:rPr>
+          <w:rFonts w:ascii="Lato" w:hAnsi="Lato"/>
+          <w:color w:val="444444"/>
+        </w:rPr>
+        <w:lastRenderedPageBreak/>
+        <w:t>where the focus is limited to specific variables or when resources to conduct a full-scale analysis are constrained.</w:t>
+      </w:r>
+    </w:p>
+    <w:p>
+      <w:pPr>
+        <w:pStyle w:val="NormalWeb"/>
+        <w:spacing w:before="180" w:beforeAutospacing="0" w:after="180" w:afterAutospacing="0" w:line="480" w:lineRule="auto"/>
+        <w:jc w:val="both"/>
+        <w:rPr>
+          <w:rFonts w:ascii="Lato" w:hAnsi="Lato"/>
+          <w:color w:val="444444"/>
+        </w:rPr>
+      </w:pPr>
+      <w:r>
+        <w:rPr>
+          <w:rFonts w:ascii="Lato" w:hAnsi="Lato"/>
+          <w:color w:val="444444"/>
+        </w:rPr>
+        <w:t>When the Triangle model is used with the Technology Acceptance model, which I have included in my evaluation plan, this alignment enables a more holistic evaluation that captures both user experience and systemic impact. TAM can provide detailed insights into user behavior and potential adoption barriers, while the Triangle Model contextualizes those behaviors within the larger healthcare ecosystem.</w:t>
+      </w:r>
+    </w:p>
+    <w:p>
+      <w:pPr>
+        <w:pStyle w:val="NormalWeb"/>
+        <w:spacing w:before="180" w:beforeAutospacing="0" w:after="180" w:afterAutospacing="0" w:line="480" w:lineRule="auto"/>
+        <w:jc w:val="both"/>
+        <w:rPr>
+          <w:rFonts w:ascii="Lato" w:hAnsi="Lato"/>
+          <w:color w:val="444444"/>
+        </w:rPr>
+      </w:pPr>
+      <w:r>
+        <w:rPr>
+          <w:rFonts w:ascii="Lato" w:hAnsi="Lato"/>
+          <w:color w:val="444444"/>
+        </w:rPr>
+        <w:t> </w:t>
+      </w:r>
+    </w:p>
+    <w:p>
+      <w:pPr>
+        <w:pStyle w:val="NormalWeb"/>
+        <w:spacing w:before="180" w:beforeAutospacing="0" w:after="180" w:afterAutospacing="0" w:line="480" w:lineRule="auto"/>
+        <w:jc w:val="both"/>
+        <w:rPr>
+          <w:rFonts w:ascii="Lato" w:hAnsi="Lato"/>
+          <w:color w:val="444444"/>
+        </w:rPr>
+      </w:pPr>
+      <w:r>
+        <w:rPr>
+          <w:rFonts w:ascii="Lato" w:hAnsi="Lato"/>
+          <w:color w:val="444444"/>
+        </w:rPr>
+        <w:t>References:</w:t>
+      </w:r>
+    </w:p>
+    <w:p>
+      <w:pPr>
+        <w:pStyle w:val="NormalWeb"/>
+        <w:spacing w:before="180" w:beforeAutospacing="0" w:after="180" w:afterAutospacing="0" w:line="480" w:lineRule="auto"/>
+        <w:jc w:val="both"/>
+        <w:rPr>
+          <w:rFonts w:ascii="Lato" w:hAnsi="Lato"/>
+          <w:color w:val="444444"/>
+        </w:rPr>
+      </w:pPr>
+      <w:proofErr w:type="spellStart"/>
+      <w:r>
+        <w:rPr>
+          <w:rFonts w:ascii="Lato" w:hAnsi="Lato"/>
+          <w:color w:val="444444"/>
+        </w:rPr>
+        <w:t>Ancker</w:t>
+      </w:r>
+      <w:proofErr w:type="spellEnd"/>
+      <w:r>
+        <w:rPr>
+          <w:rFonts w:ascii="Lato" w:hAnsi="Lato"/>
+          <w:color w:val="444444"/>
+        </w:rPr>
+        <w:t>, J. S., Kern, L. M., Abramson, E., &amp; Kaushal, R. (2012). The Triangle Model for evaluating the effect of health information technology on healthcare quality and safety. </w:t>
+      </w:r>
+      <w:r>
+        <w:rPr>
+          <w:rStyle w:val="Emphasis"/>
+          <w:rFonts w:ascii="Lato" w:hAnsi="Lato"/>
+          <w:color w:val="444444"/>
+        </w:rPr>
+        <w:t xml:space="preserve">Journal of the American Medical Informatics </w:t>
+      </w:r>
+      <w:proofErr w:type="gramStart"/>
+      <w:r>
+        <w:rPr>
+          <w:rStyle w:val="Emphasis"/>
+          <w:rFonts w:ascii="Lato" w:hAnsi="Lato"/>
+          <w:color w:val="444444"/>
+        </w:rPr>
+        <w:t>Association :</w:t>
+      </w:r>
+      <w:proofErr w:type="gramEnd"/>
+      <w:r>
+        <w:rPr>
+          <w:rStyle w:val="Emphasis"/>
+          <w:rFonts w:ascii="Lato" w:hAnsi="Lato"/>
+          <w:color w:val="444444"/>
+        </w:rPr>
+        <w:t xml:space="preserve"> JAMIA</w:t>
+      </w:r>
+      <w:r>
+        <w:rPr>
+          <w:rFonts w:ascii="Lato" w:hAnsi="Lato"/>
+          <w:color w:val="444444"/>
+        </w:rPr>
+        <w:t>, </w:t>
+      </w:r>
+      <w:r>
+        <w:rPr>
+          <w:rStyle w:val="Emphasis"/>
+          <w:rFonts w:ascii="Lato" w:hAnsi="Lato"/>
+          <w:color w:val="444444"/>
+        </w:rPr>
+        <w:t>19</w:t>
+      </w:r>
+      <w:r>
+        <w:rPr>
+          <w:rFonts w:ascii="Lato" w:hAnsi="Lato"/>
+          <w:color w:val="444444"/>
+        </w:rPr>
+        <w:t>(1), 61–65.</w:t>
+      </w:r>
+    </w:p>
+    <w:p>
+      <w:pPr>
+        <w:pStyle w:val="NormalWeb"/>
+        <w:spacing w:before="0" w:beforeAutospacing="0" w:after="0" w:afterAutospacing="0" w:line="480" w:lineRule="auto"/>
+        <w:jc w:val="both"/>
+        <w:rPr>
+          <w:rFonts w:ascii="Lato" w:hAnsi="Lato"/>
+          <w:color w:val="444444"/>
+        </w:rPr>
+      </w:pPr>
+      <w:hyperlink r:id="rId11" w:tgtFrame="_blank" w:history="1">
+        <w:r>
+          <w:rPr>
+            <w:rStyle w:val="Hyperlink"/>
+            <w:rFonts w:ascii="Lato" w:hAnsi="Lato"/>
+          </w:rPr>
+          <w:t>https://doi.org/10.1136/amiajnl-2011-000385</w:t>
+        </w:r>
+        <w:r>
+          <w:rPr>
+            <w:rStyle w:val="screenreader-only"/>
+            <w:rFonts w:ascii="Lato" w:hAnsi="Lato"/>
+            <w:color w:val="0000FF"/>
+            <w:u w:val="single"/>
+            <w:bdr w:val="none" w:sz="0" w:space="0" w:color="auto" w:frame="1"/>
+          </w:rPr>
+          <w:t>Links to an external site.</w:t>
+        </w:r>
+      </w:hyperlink>
+    </w:p>
+    <w:p>
+      <w:pPr>
+        <w:pStyle w:val="NormalWeb"/>
+        <w:spacing w:before="180" w:beforeAutospacing="0" w:after="180" w:afterAutospacing="0" w:line="480" w:lineRule="auto"/>
+        <w:jc w:val="both"/>
+        <w:rPr>
+          <w:color w:val="444444"/>
+        </w:rPr>
+      </w:pPr>
+    </w:p>
+    <w:p>
+      <w:pPr>
         <w:spacing w:line="480" w:lineRule="auto"/>
         <w:jc w:val="both"/>
         <w:rPr>
@@ -1337,8 +1582,8 @@
       </w:pPr>
     </w:p>
     <w:sectPr>
-      <w:footerReference w:type="even" r:id="rId11"/>
-      <w:footerReference w:type="default" r:id="rId12"/>
+      <w:footerReference w:type="even" r:id="rId12"/>
+      <w:footerReference w:type="default" r:id="rId13"/>
       <w:pgSz w:w="12240" w:h="15840"/>
       <w:pgMar w:top="1440" w:right="1440" w:bottom="1440" w:left="1440" w:header="720" w:footer="720" w:gutter="0"/>
       <w:pgNumType w:start="0"/>

</xml_diff>